<commit_message>
docs: actualizar Fase 2 con evidencias grupales, individuales y de proyecto completas
</commit_message>
<xml_diff>
--- a/Fase 2/Evidencias Grupales/Documento de avance de sprint.docx
+++ b/Fase 2/Evidencias Grupales/Documento de avance de sprint.docx
@@ -15,7 +15,7 @@
         <w:rPr>
           <w:rFonts w:ascii="Tahoma" w:hAnsi="Tahoma"/>
         </w:rPr>
-        <w:t>Informe de cierre sprint XX</w:t>
+        <w:t>Informe de cierre sprint Fase 2</w:t>
       </w:r>
     </w:p>
     <w:tbl>
@@ -79,7 +79,6 @@
                 <w:bCs/>
               </w:rPr>
             </w:pPr>
-            <w:proofErr w:type="spellStart"/>
             <w:r>
               <w:rPr>
                 <w:rFonts w:ascii="Tahoma" w:hAnsi="Tahoma"/>
@@ -88,7 +87,6 @@
               </w:rPr>
               <w:t>N°</w:t>
             </w:r>
-            <w:proofErr w:type="spellEnd"/>
           </w:p>
         </w:tc>
         <w:tc>
@@ -176,6 +174,10 @@
           </w:tcPr>
           <w:p>
             <w:pPr>
+              <w:numPr>
+                <w:ilvl w:val="0"/>
+                <w:numId w:val="0"/>
+              </w:numPr>
               <w:rPr>
                 <w:rFonts w:ascii="Tahoma" w:hAnsi="Tahoma"/>
               </w:rPr>
@@ -183,20 +185,10 @@
             <w:r>
               <w:rPr>
                 <w:rFonts w:ascii="Tahoma" w:hAnsi="Tahoma"/>
-              </w:rPr>
-              <w:t>APT</w:t>
-            </w:r>
-            <w:r>
-              <w:rPr>
-                <w:rFonts w:ascii="Tahoma" w:hAnsi="Tahoma"/>
-              </w:rPr>
-              <w:t xml:space="preserve"> - 0</w:t>
-            </w:r>
-            <w:r>
-              <w:rPr>
-                <w:rFonts w:ascii="Tahoma" w:hAnsi="Tahoma"/>
-              </w:rPr>
-              <w:t>1</w:t>
+                <w:i w:val="0"/>
+                <w:iCs w:val="0"/>
+              </w:rPr>
+              <w:t xml:space="preserve">APT - 02</w:t>
             </w:r>
           </w:p>
         </w:tc>
@@ -206,6 +198,10 @@
           </w:tcPr>
           <w:p>
             <w:pPr>
+              <w:numPr>
+                <w:ilvl w:val="0"/>
+                <w:numId w:val="0"/>
+              </w:numPr>
               <w:jc w:val="center"/>
               <w:cnfStyle w:val="000000100000" w:firstRow="0" w:lastRow="0" w:firstColumn="0" w:lastColumn="0" w:oddVBand="0" w:evenVBand="0" w:oddHBand="1" w:evenHBand="0" w:firstRowFirstColumn="0" w:firstRowLastColumn="0" w:lastRowFirstColumn="0" w:lastRowLastColumn="0"/>
               <w:rPr>
@@ -215,8 +211,10 @@
             <w:r>
               <w:rPr>
                 <w:rFonts w:ascii="Tahoma" w:hAnsi="Tahoma"/>
-              </w:rPr>
-              <w:t>1.0</w:t>
+                <w:i w:val="0"/>
+                <w:iCs w:val="0"/>
+              </w:rPr>
+              <w:t xml:space="preserve">1.0</w:t>
             </w:r>
           </w:p>
         </w:tc>
@@ -229,6 +227,10 @@
           <w:p>
             <w:pPr>
               <w:pStyle w:val="Encabezado"/>
+              <w:numPr>
+                <w:ilvl w:val="0"/>
+                <w:numId w:val="0"/>
+              </w:numPr>
               <w:tabs>
                 <w:tab w:val="clear" w:pos="4320"/>
                 <w:tab w:val="clear" w:pos="8640"/>
@@ -240,20 +242,10 @@
             <w:r>
               <w:rPr>
                 <w:rFonts w:ascii="Tahoma" w:hAnsi="Tahoma"/>
-              </w:rPr>
-              <w:t xml:space="preserve">Asignatura </w:t>
-            </w:r>
-            <w:r>
-              <w:rPr>
-                <w:rFonts w:ascii="Tahoma" w:hAnsi="Tahoma"/>
-              </w:rPr>
-              <w:t>Portafolio de Titulo</w:t>
-            </w:r>
-            <w:r>
-              <w:rPr>
-                <w:rFonts w:ascii="Tahoma" w:hAnsi="Tahoma"/>
-              </w:rPr>
-              <w:t xml:space="preserve"> </w:t>
+                <w:i w:val="0"/>
+                <w:iCs w:val="0"/>
+              </w:rPr>
+              <w:t xml:space="preserve">Cierre de Sprint Fase 2: Construcción y Validación Integral</w:t>
             </w:r>
           </w:p>
         </w:tc>
@@ -264,6 +256,10 @@
           <w:p>
             <w:pPr>
               <w:pStyle w:val="Encabezado"/>
+              <w:numPr>
+                <w:ilvl w:val="0"/>
+                <w:numId w:val="0"/>
+              </w:numPr>
               <w:tabs>
                 <w:tab w:val="clear" w:pos="4320"/>
                 <w:tab w:val="clear" w:pos="8640"/>
@@ -274,6 +270,15 @@
                 <w:lang w:val="es-ES"/>
               </w:rPr>
             </w:pPr>
+            <w:r>
+              <w:rPr>
+                <w:rFonts w:ascii="Tahoma" w:hAnsi="Tahoma"/>
+                <w:i w:val="0"/>
+                <w:iCs w:val="0"/>
+                <w:lang w:val="es-ES"/>
+              </w:rPr>
+              <w:t xml:space="preserve">Felipe Romero Díaz</w:t>
+            </w:r>
           </w:p>
         </w:tc>
       </w:tr>
@@ -365,11 +370,23 @@
           </w:tcPr>
           <w:p>
             <w:pPr>
+              <w:numPr>
+                <w:ilvl w:val="0"/>
+                <w:numId w:val="0"/>
+              </w:numPr>
               <w:jc w:val="center"/>
               <w:rPr>
                 <w:rFonts w:ascii="Tahoma" w:hAnsi="Tahoma"/>
               </w:rPr>
             </w:pPr>
+            <w:r>
+              <w:rPr>
+                <w:rFonts w:ascii="Tahoma" w:hAnsi="Tahoma"/>
+                <w:i w:val="0"/>
+                <w:iCs w:val="0"/>
+              </w:rPr>
+              <w:t xml:space="preserve">12-10-2026</w:t>
+            </w:r>
           </w:p>
         </w:tc>
         <w:tc>
@@ -379,6 +396,10 @@
           <w:p>
             <w:pPr>
               <w:pStyle w:val="Encabezado"/>
+              <w:numPr>
+                <w:ilvl w:val="0"/>
+                <w:numId w:val="0"/>
+              </w:numPr>
               <w:tabs>
                 <w:tab w:val="clear" w:pos="4320"/>
                 <w:tab w:val="clear" w:pos="8640"/>
@@ -392,8 +413,10 @@
             <w:r>
               <w:rPr>
                 <w:rFonts w:ascii="Tahoma" w:hAnsi="Tahoma"/>
-              </w:rPr>
-              <w:t>Duoc UC.</w:t>
+                <w:i w:val="0"/>
+                <w:iCs w:val="0"/>
+              </w:rPr>
+              <w:t xml:space="preserve">Duoc UC / Virtual</w:t>
             </w:r>
           </w:p>
         </w:tc>
@@ -406,6 +429,10 @@
           <w:p>
             <w:pPr>
               <w:pStyle w:val="Encabezado"/>
+              <w:numPr>
+                <w:ilvl w:val="0"/>
+                <w:numId w:val="0"/>
+              </w:numPr>
               <w:tabs>
                 <w:tab w:val="clear" w:pos="4320"/>
                 <w:tab w:val="clear" w:pos="8640"/>
@@ -416,6 +443,15 @@
                 <w:lang w:val="es-ES"/>
               </w:rPr>
             </w:pPr>
+            <w:r>
+              <w:rPr>
+                <w:rFonts w:ascii="Tahoma" w:hAnsi="Tahoma"/>
+                <w:i w:val="0"/>
+                <w:iCs w:val="0"/>
+                <w:lang w:val="es-ES"/>
+              </w:rPr>
+              <w:t xml:space="preserve">NovaFit Analytics Suite</w:t>
+            </w:r>
           </w:p>
         </w:tc>
       </w:tr>
@@ -595,25 +631,72 @@
           </w:tcPr>
           <w:p>
             <w:pPr>
+              <w:numPr>
+                <w:ilvl w:val="0"/>
+                <w:numId w:val="0"/>
+              </w:numPr>
+              <w:spacing w:after="0"/>
               <w:jc w:val="center"/>
               <w:rPr>
                 <w:rFonts w:ascii="Arial" w:eastAsia="Arial Unicode MS" w:hAnsi="Arial" w:cs="Arial"/>
               </w:rPr>
             </w:pPr>
+            <w:r>
+              <w:rPr>
+                <w:rFonts w:ascii="Arial" w:eastAsia="Arial Unicode MS" w:hAnsi="Arial" w:cs="Arial"/>
+                <w:i w:val="0"/>
+                <w:iCs w:val="0"/>
+              </w:rPr>
+              <w:t xml:space="preserve">Felipe Romero Díaz</w:t>
+            </w:r>
+          </w:p>
+          <w:p>
+            <w:pPr>
+              <w:numPr>
+                <w:ilvl w:val="0"/>
+                <w:numId w:val="0"/>
+              </w:numPr>
+              <w:spacing w:after="0"/>
+              <w:jc w:val="center"/>
+              <w:rPr>
+                <w:rFonts w:ascii="Arial" w:eastAsia="Arial Unicode MS" w:hAnsi="Arial" w:cs="Arial"/>
+              </w:rPr>
+            </w:pPr>
+            <w:r>
+              <w:rPr>
+                <w:rFonts w:ascii="Arial" w:eastAsia="Arial Unicode MS" w:hAnsi="Arial" w:cs="Arial"/>
+                <w:i w:val="0"/>
+                <w:iCs w:val="0"/>
+              </w:rPr>
+              <w:t xml:space="preserve">NovaFit / Project Manager &amp; Tech Lead</w:t>
+            </w:r>
           </w:p>
         </w:tc>
         <w:tc>
           <w:tcPr>
             <w:tcW w:w="1559" w:type="dxa"/>
-            <w:noWrap/>
           </w:tcPr>
           <w:p>
             <w:pPr>
+              <w:numPr>
+                <w:ilvl w:val="0"/>
+                <w:numId w:val="0"/>
+              </w:numPr>
+              <w:spacing w:after="0"/>
+              <w:jc w:val="center"/>
               <w:cnfStyle w:val="000000100000" w:firstRow="0" w:lastRow="0" w:firstColumn="0" w:lastColumn="0" w:oddVBand="0" w:evenVBand="0" w:oddHBand="1" w:evenHBand="0" w:firstRowFirstColumn="0" w:firstRowLastColumn="0" w:lastRowFirstColumn="0" w:lastRowLastColumn="0"/>
               <w:rPr>
                 <w:rFonts w:ascii="Tahoma" w:hAnsi="Tahoma" w:cs="Tahoma"/>
               </w:rPr>
             </w:pPr>
+            <w:r>
+              <w:rPr>
+                <w:rFonts w:ascii="Tahoma" w:hAnsi="Tahoma" w:cs="Tahoma"/>
+                <w:i w:val="0"/>
+                <w:iCs w:val="0"/>
+              </w:rPr>
+              <w:t xml:space="preserve">NovaFit</w:t>
+            </w:r>
           </w:p>
         </w:tc>
         <w:tc>
@@ -621,23 +704,46 @@
             <w:cnfStyle w:val="000010000000" w:firstRow="0" w:lastRow="0" w:firstColumn="0" w:lastColumn="0" w:oddVBand="1" w:evenVBand="0" w:oddHBand="0" w:evenHBand="0" w:firstRowFirstColumn="0" w:firstRowLastColumn="0" w:lastRowFirstColumn="0" w:lastRowLastColumn="0"/>
             <w:tcW w:w="1559" w:type="dxa"/>
             <w:noWrap/>
+            <w:tcMar>
+              <w:left w:w="30" w:type="dxa"/>
+              <w:right w:w="30" w:type="dxa"/>
+            </w:tcMar>
           </w:tcPr>
           <w:p>
             <w:pPr>
-              <w:jc w:val="right"/>
+              <w:numPr>
+                <w:ilvl w:val="0"/>
+                <w:numId w:val="0"/>
+              </w:numPr>
+              <w:spacing w:after="0"/>
+              <w:jc w:val="center"/>
               <w:rPr>
                 <w:rFonts w:ascii="Tahoma" w:hAnsi="Tahoma" w:cs="Tahoma"/>
               </w:rPr>
             </w:pPr>
+            <w:r>
+              <w:rPr>
+                <w:rFonts w:ascii="Tahoma" w:hAnsi="Tahoma" w:cs="Tahoma"/>
+                <w:i w:val="0"/>
+                <w:iCs w:val="0"/>
+                <w:sz w:val="16"/>
+                <w:szCs w:val="16"/>
+              </w:rPr>
+              <w:t xml:space="preserve">+56 9 4915 8495</w:t>
+            </w:r>
           </w:p>
         </w:tc>
         <w:tc>
           <w:tcPr>
             <w:tcW w:w="3260" w:type="dxa"/>
-            <w:noWrap/>
           </w:tcPr>
           <w:p>
             <w:pPr>
+              <w:numPr>
+                <w:ilvl w:val="0"/>
+                <w:numId w:val="0"/>
+              </w:numPr>
+              <w:spacing w:after="0"/>
               <w:cnfStyle w:val="000000100000" w:firstRow="0" w:lastRow="0" w:firstColumn="0" w:lastColumn="0" w:oddVBand="0" w:evenVBand="0" w:oddHBand="1" w:evenHBand="0" w:firstRowFirstColumn="0" w:firstRowLastColumn="0" w:lastRowFirstColumn="0" w:lastRowLastColumn="0"/>
               <w:rPr>
                 <w:rFonts w:ascii="Tahoma" w:hAnsi="Tahoma" w:cs="Tahoma"/>
@@ -645,6 +751,16 @@
                 <w:u w:val="single"/>
               </w:rPr>
             </w:pPr>
+            <w:r>
+              <w:rPr>
+                <w:rFonts w:ascii="Tahoma" w:hAnsi="Tahoma" w:cs="Tahoma"/>
+                <w:i w:val="0"/>
+                <w:iCs w:val="0"/>
+                <w:color w:val="0000FF"/>
+                <w:u w:val="single"/>
+              </w:rPr>
+              <w:t xml:space="preserve">fe.romerod@duocuc.cl</w:t>
+            </w:r>
           </w:p>
         </w:tc>
       </w:tr>
@@ -659,25 +775,72 @@
           </w:tcPr>
           <w:p>
             <w:pPr>
+              <w:numPr>
+                <w:ilvl w:val="0"/>
+                <w:numId w:val="0"/>
+              </w:numPr>
+              <w:spacing w:after="0"/>
               <w:jc w:val="center"/>
               <w:rPr>
                 <w:rFonts w:ascii="Arial" w:eastAsia="Arial Unicode MS" w:hAnsi="Arial" w:cs="Arial"/>
               </w:rPr>
             </w:pPr>
+            <w:r>
+              <w:rPr>
+                <w:rFonts w:ascii="Arial" w:eastAsia="Arial Unicode MS" w:hAnsi="Arial" w:cs="Arial"/>
+                <w:i w:val="0"/>
+                <w:iCs w:val="0"/>
+              </w:rPr>
+              <w:t xml:space="preserve">Vicente Gilbert Espinosa</w:t>
+            </w:r>
+          </w:p>
+          <w:p>
+            <w:pPr>
+              <w:numPr>
+                <w:ilvl w:val="0"/>
+                <w:numId w:val="0"/>
+              </w:numPr>
+              <w:spacing w:after="0"/>
+              <w:jc w:val="center"/>
+              <w:rPr>
+                <w:rFonts w:ascii="Arial" w:eastAsia="Arial Unicode MS" w:hAnsi="Arial" w:cs="Arial"/>
+              </w:rPr>
+            </w:pPr>
+            <w:r>
+              <w:rPr>
+                <w:rFonts w:ascii="Arial" w:eastAsia="Arial Unicode MS" w:hAnsi="Arial" w:cs="Arial"/>
+                <w:i w:val="0"/>
+                <w:iCs w:val="0"/>
+              </w:rPr>
+              <w:t xml:space="preserve">NovaFit / Backend Developer</w:t>
+            </w:r>
           </w:p>
         </w:tc>
         <w:tc>
           <w:tcPr>
             <w:tcW w:w="1559" w:type="dxa"/>
-            <w:noWrap/>
           </w:tcPr>
           <w:p>
             <w:pPr>
+              <w:numPr>
+                <w:ilvl w:val="0"/>
+                <w:numId w:val="0"/>
+              </w:numPr>
+              <w:spacing w:after="0"/>
+              <w:jc w:val="center"/>
               <w:cnfStyle w:val="000000000000" w:firstRow="0" w:lastRow="0" w:firstColumn="0" w:lastColumn="0" w:oddVBand="0" w:evenVBand="0" w:oddHBand="0" w:evenHBand="0" w:firstRowFirstColumn="0" w:firstRowLastColumn="0" w:lastRowFirstColumn="0" w:lastRowLastColumn="0"/>
               <w:rPr>
                 <w:rFonts w:ascii="Tahoma" w:hAnsi="Tahoma" w:cs="Tahoma"/>
               </w:rPr>
             </w:pPr>
+            <w:r>
+              <w:rPr>
+                <w:rFonts w:ascii="Tahoma" w:hAnsi="Tahoma" w:cs="Tahoma"/>
+                <w:i w:val="0"/>
+                <w:iCs w:val="0"/>
+              </w:rPr>
+              <w:t xml:space="preserve">NovaFit</w:t>
+            </w:r>
           </w:p>
         </w:tc>
         <w:tc>
@@ -685,23 +848,46 @@
             <w:cnfStyle w:val="000010000000" w:firstRow="0" w:lastRow="0" w:firstColumn="0" w:lastColumn="0" w:oddVBand="1" w:evenVBand="0" w:oddHBand="0" w:evenHBand="0" w:firstRowFirstColumn="0" w:firstRowLastColumn="0" w:lastRowFirstColumn="0" w:lastRowLastColumn="0"/>
             <w:tcW w:w="1559" w:type="dxa"/>
             <w:noWrap/>
+            <w:tcMar>
+              <w:left w:w="30" w:type="dxa"/>
+              <w:right w:w="30" w:type="dxa"/>
+            </w:tcMar>
           </w:tcPr>
           <w:p>
             <w:pPr>
-              <w:jc w:val="right"/>
+              <w:numPr>
+                <w:ilvl w:val="0"/>
+                <w:numId w:val="0"/>
+              </w:numPr>
+              <w:spacing w:after="0"/>
+              <w:jc w:val="center"/>
               <w:rPr>
                 <w:rFonts w:ascii="Tahoma" w:hAnsi="Tahoma" w:cs="Tahoma"/>
               </w:rPr>
             </w:pPr>
+            <w:r>
+              <w:rPr>
+                <w:rFonts w:ascii="Tahoma" w:hAnsi="Tahoma" w:cs="Tahoma"/>
+                <w:i w:val="0"/>
+                <w:iCs w:val="0"/>
+                <w:sz w:val="16"/>
+                <w:szCs w:val="16"/>
+              </w:rPr>
+              <w:t xml:space="preserve">+56 9 7569 9413</w:t>
+            </w:r>
           </w:p>
         </w:tc>
         <w:tc>
           <w:tcPr>
             <w:tcW w:w="3260" w:type="dxa"/>
-            <w:noWrap/>
           </w:tcPr>
           <w:p>
             <w:pPr>
+              <w:numPr>
+                <w:ilvl w:val="0"/>
+                <w:numId w:val="0"/>
+              </w:numPr>
+              <w:spacing w:after="0"/>
               <w:cnfStyle w:val="000000000000" w:firstRow="0" w:lastRow="0" w:firstColumn="0" w:lastColumn="0" w:oddVBand="0" w:evenVBand="0" w:oddHBand="0" w:evenHBand="0" w:firstRowFirstColumn="0" w:firstRowLastColumn="0" w:lastRowFirstColumn="0" w:lastRowLastColumn="0"/>
               <w:rPr>
                 <w:rFonts w:ascii="Tahoma" w:hAnsi="Tahoma" w:cs="Tahoma"/>
@@ -709,6 +895,16 @@
                 <w:u w:val="single"/>
               </w:rPr>
             </w:pPr>
+            <w:r>
+              <w:rPr>
+                <w:rFonts w:ascii="Tahoma" w:hAnsi="Tahoma" w:cs="Tahoma"/>
+                <w:i w:val="0"/>
+                <w:iCs w:val="0"/>
+                <w:color w:val="0000FF"/>
+                <w:u w:val="single"/>
+              </w:rPr>
+              <w:t xml:space="preserve">vi.gilbert@duocuc.cl</w:t>
+            </w:r>
           </w:p>
         </w:tc>
       </w:tr>
@@ -724,25 +920,72 @@
           </w:tcPr>
           <w:p>
             <w:pPr>
+              <w:numPr>
+                <w:ilvl w:val="0"/>
+                <w:numId w:val="0"/>
+              </w:numPr>
+              <w:spacing w:after="0"/>
               <w:jc w:val="center"/>
               <w:rPr>
                 <w:rFonts w:ascii="Arial" w:eastAsia="Arial Unicode MS" w:hAnsi="Arial" w:cs="Arial"/>
               </w:rPr>
             </w:pPr>
+            <w:r>
+              <w:rPr>
+                <w:rFonts w:ascii="Arial" w:eastAsia="Arial Unicode MS" w:hAnsi="Arial" w:cs="Arial"/>
+                <w:i w:val="0"/>
+                <w:iCs w:val="0"/>
+              </w:rPr>
+              <w:t xml:space="preserve">Yulian Silva</w:t>
+            </w:r>
+          </w:p>
+          <w:p>
+            <w:pPr>
+              <w:numPr>
+                <w:ilvl w:val="0"/>
+                <w:numId w:val="0"/>
+              </w:numPr>
+              <w:spacing w:after="0"/>
+              <w:jc w:val="center"/>
+              <w:rPr>
+                <w:rFonts w:ascii="Arial" w:eastAsia="Arial Unicode MS" w:hAnsi="Arial" w:cs="Arial"/>
+              </w:rPr>
+            </w:pPr>
+            <w:r>
+              <w:rPr>
+                <w:rFonts w:ascii="Arial" w:eastAsia="Arial Unicode MS" w:hAnsi="Arial" w:cs="Arial"/>
+                <w:i w:val="0"/>
+                <w:iCs w:val="0"/>
+              </w:rPr>
+              <w:t xml:space="preserve">NovaFit / DBA &amp; Arquitecto de Datos</w:t>
+            </w:r>
           </w:p>
         </w:tc>
         <w:tc>
           <w:tcPr>
             <w:tcW w:w="1559" w:type="dxa"/>
-            <w:noWrap/>
           </w:tcPr>
           <w:p>
             <w:pPr>
+              <w:numPr>
+                <w:ilvl w:val="0"/>
+                <w:numId w:val="0"/>
+              </w:numPr>
+              <w:spacing w:after="0"/>
+              <w:jc w:val="center"/>
               <w:cnfStyle w:val="000000100000" w:firstRow="0" w:lastRow="0" w:firstColumn="0" w:lastColumn="0" w:oddVBand="0" w:evenVBand="0" w:oddHBand="1" w:evenHBand="0" w:firstRowFirstColumn="0" w:firstRowLastColumn="0" w:lastRowFirstColumn="0" w:lastRowLastColumn="0"/>
               <w:rPr>
                 <w:rFonts w:ascii="Tahoma" w:hAnsi="Tahoma" w:cs="Tahoma"/>
               </w:rPr>
             </w:pPr>
+            <w:r>
+              <w:rPr>
+                <w:rFonts w:ascii="Tahoma" w:hAnsi="Tahoma" w:cs="Tahoma"/>
+                <w:i w:val="0"/>
+                <w:iCs w:val="0"/>
+              </w:rPr>
+              <w:t xml:space="preserve">NovaFit</w:t>
+            </w:r>
           </w:p>
         </w:tc>
         <w:tc>
@@ -750,23 +993,46 @@
             <w:cnfStyle w:val="000010000000" w:firstRow="0" w:lastRow="0" w:firstColumn="0" w:lastColumn="0" w:oddVBand="1" w:evenVBand="0" w:oddHBand="0" w:evenHBand="0" w:firstRowFirstColumn="0" w:firstRowLastColumn="0" w:lastRowFirstColumn="0" w:lastRowLastColumn="0"/>
             <w:tcW w:w="1559" w:type="dxa"/>
             <w:noWrap/>
+            <w:tcMar>
+              <w:left w:w="30" w:type="dxa"/>
+              <w:right w:w="30" w:type="dxa"/>
+            </w:tcMar>
           </w:tcPr>
           <w:p>
             <w:pPr>
-              <w:jc w:val="right"/>
+              <w:numPr>
+                <w:ilvl w:val="0"/>
+                <w:numId w:val="0"/>
+              </w:numPr>
+              <w:spacing w:after="0"/>
+              <w:jc w:val="center"/>
               <w:rPr>
                 <w:rFonts w:ascii="Tahoma" w:hAnsi="Tahoma" w:cs="Tahoma"/>
               </w:rPr>
             </w:pPr>
+            <w:r>
+              <w:rPr>
+                <w:rFonts w:ascii="Tahoma" w:hAnsi="Tahoma" w:cs="Tahoma"/>
+                <w:i w:val="0"/>
+                <w:iCs w:val="0"/>
+                <w:sz w:val="16"/>
+                <w:szCs w:val="16"/>
+              </w:rPr>
+              <w:t xml:space="preserve">+56 9 7331 0085</w:t>
+            </w:r>
           </w:p>
         </w:tc>
         <w:tc>
           <w:tcPr>
             <w:tcW w:w="3260" w:type="dxa"/>
-            <w:noWrap/>
           </w:tcPr>
           <w:p>
             <w:pPr>
+              <w:numPr>
+                <w:ilvl w:val="0"/>
+                <w:numId w:val="0"/>
+              </w:numPr>
+              <w:spacing w:after="0"/>
               <w:cnfStyle w:val="000000100000" w:firstRow="0" w:lastRow="0" w:firstColumn="0" w:lastColumn="0" w:oddVBand="0" w:evenVBand="0" w:oddHBand="1" w:evenHBand="0" w:firstRowFirstColumn="0" w:firstRowLastColumn="0" w:lastRowFirstColumn="0" w:lastRowLastColumn="0"/>
               <w:rPr>
                 <w:rFonts w:ascii="Tahoma" w:hAnsi="Tahoma" w:cs="Tahoma"/>
@@ -774,6 +1040,16 @@
                 <w:u w:val="single"/>
               </w:rPr>
             </w:pPr>
+            <w:r>
+              <w:rPr>
+                <w:rFonts w:ascii="Tahoma" w:hAnsi="Tahoma" w:cs="Tahoma"/>
+                <w:i w:val="0"/>
+                <w:iCs w:val="0"/>
+                <w:color w:val="0000FF"/>
+                <w:u w:val="single"/>
+              </w:rPr>
+              <w:t xml:space="preserve">yuli.silva@duocuc.cl</w:t>
+            </w:r>
           </w:p>
         </w:tc>
       </w:tr>
@@ -788,27 +1064,78 @@
           </w:tcPr>
           <w:p>
             <w:pPr>
+              <w:numPr>
+                <w:ilvl w:val="0"/>
+                <w:numId w:val="0"/>
+              </w:numPr>
+              <w:spacing w:after="0"/>
               <w:jc w:val="center"/>
               <w:rPr>
                 <w:rFonts w:ascii="Arial" w:eastAsia="Arial Unicode MS" w:hAnsi="Arial" w:cs="Arial"/>
                 <w:lang w:val="fr-FR"/>
               </w:rPr>
             </w:pPr>
+            <w:r>
+              <w:rPr>
+                <w:rFonts w:ascii="Arial" w:eastAsia="Arial Unicode MS" w:hAnsi="Arial" w:cs="Arial"/>
+                <w:i w:val="0"/>
+                <w:iCs w:val="0"/>
+                <w:lang w:val="fr-FR"/>
+              </w:rPr>
+              <w:t xml:space="preserve">Antonio Maturana</w:t>
+            </w:r>
+          </w:p>
+          <w:p>
+            <w:pPr>
+              <w:numPr>
+                <w:ilvl w:val="0"/>
+                <w:numId w:val="0"/>
+              </w:numPr>
+              <w:spacing w:after="0"/>
+              <w:jc w:val="center"/>
+              <w:rPr>
+                <w:rFonts w:ascii="Arial" w:eastAsia="Arial Unicode MS" w:hAnsi="Arial" w:cs="Arial"/>
+                <w:lang w:val="fr-FR"/>
+              </w:rPr>
+            </w:pPr>
+            <w:r>
+              <w:rPr>
+                <w:rFonts w:ascii="Arial" w:eastAsia="Arial Unicode MS" w:hAnsi="Arial" w:cs="Arial"/>
+                <w:i w:val="0"/>
+                <w:iCs w:val="0"/>
+                <w:lang w:val="fr-FR"/>
+              </w:rPr>
+              <w:t xml:space="preserve">NovaFit / Frontend &amp; Mobile Developer</w:t>
+            </w:r>
           </w:p>
         </w:tc>
         <w:tc>
           <w:tcPr>
             <w:tcW w:w="1559" w:type="dxa"/>
-            <w:noWrap/>
           </w:tcPr>
           <w:p>
             <w:pPr>
+              <w:numPr>
+                <w:ilvl w:val="0"/>
+                <w:numId w:val="0"/>
+              </w:numPr>
+              <w:spacing w:after="0"/>
+              <w:jc w:val="center"/>
               <w:cnfStyle w:val="000000000000" w:firstRow="0" w:lastRow="0" w:firstColumn="0" w:lastColumn="0" w:oddVBand="0" w:evenVBand="0" w:oddHBand="0" w:evenHBand="0" w:firstRowFirstColumn="0" w:firstRowLastColumn="0" w:lastRowFirstColumn="0" w:lastRowLastColumn="0"/>
               <w:rPr>
                 <w:rFonts w:ascii="Tahoma" w:hAnsi="Tahoma" w:cs="Tahoma"/>
                 <w:lang w:val="fr-FR"/>
               </w:rPr>
             </w:pPr>
+            <w:r>
+              <w:rPr>
+                <w:rFonts w:ascii="Tahoma" w:hAnsi="Tahoma" w:cs="Tahoma"/>
+                <w:i w:val="0"/>
+                <w:iCs w:val="0"/>
+                <w:lang w:val="fr-FR"/>
+              </w:rPr>
+              <w:t xml:space="preserve">NovaFit</w:t>
+            </w:r>
           </w:p>
         </w:tc>
         <w:tc>
@@ -816,24 +1143,48 @@
             <w:cnfStyle w:val="000010000000" w:firstRow="0" w:lastRow="0" w:firstColumn="0" w:lastColumn="0" w:oddVBand="1" w:evenVBand="0" w:oddHBand="0" w:evenHBand="0" w:firstRowFirstColumn="0" w:firstRowLastColumn="0" w:lastRowFirstColumn="0" w:lastRowLastColumn="0"/>
             <w:tcW w:w="1559" w:type="dxa"/>
             <w:noWrap/>
+            <w:tcMar>
+              <w:left w:w="30" w:type="dxa"/>
+              <w:right w:w="30" w:type="dxa"/>
+            </w:tcMar>
           </w:tcPr>
           <w:p>
             <w:pPr>
-              <w:jc w:val="right"/>
+              <w:numPr>
+                <w:ilvl w:val="0"/>
+                <w:numId w:val="0"/>
+              </w:numPr>
+              <w:spacing w:after="0"/>
+              <w:jc w:val="center"/>
               <w:rPr>
                 <w:rFonts w:ascii="Tahoma" w:hAnsi="Tahoma" w:cs="Tahoma"/>
                 <w:lang w:val="fr-FR"/>
               </w:rPr>
             </w:pPr>
+            <w:r>
+              <w:rPr>
+                <w:rFonts w:ascii="Tahoma" w:hAnsi="Tahoma" w:cs="Tahoma"/>
+                <w:i w:val="0"/>
+                <w:iCs w:val="0"/>
+                <w:lang w:val="fr-FR"/>
+                <w:sz w:val="16"/>
+                <w:szCs w:val="16"/>
+              </w:rPr>
+              <w:t xml:space="preserve">+56 9 9142 9282</w:t>
+            </w:r>
           </w:p>
         </w:tc>
         <w:tc>
           <w:tcPr>
             <w:tcW w:w="3260" w:type="dxa"/>
-            <w:noWrap/>
           </w:tcPr>
           <w:p>
             <w:pPr>
+              <w:numPr>
+                <w:ilvl w:val="0"/>
+                <w:numId w:val="0"/>
+              </w:numPr>
+              <w:spacing w:after="0"/>
               <w:cnfStyle w:val="000000000000" w:firstRow="0" w:lastRow="0" w:firstColumn="0" w:lastColumn="0" w:oddVBand="0" w:evenVBand="0" w:oddHBand="0" w:evenHBand="0" w:firstRowFirstColumn="0" w:firstRowLastColumn="0" w:lastRowFirstColumn="0" w:lastRowLastColumn="0"/>
               <w:rPr>
                 <w:rFonts w:ascii="Tahoma" w:hAnsi="Tahoma" w:cs="Tahoma"/>
@@ -842,6 +1193,171 @@
                 <w:lang w:val="fr-FR"/>
               </w:rPr>
             </w:pPr>
+            <w:r>
+              <w:rPr>
+                <w:rFonts w:ascii="Tahoma" w:hAnsi="Tahoma" w:cs="Tahoma"/>
+                <w:i w:val="0"/>
+                <w:iCs w:val="0"/>
+                <w:color w:val="0000FF"/>
+                <w:u w:val="single"/>
+                <w:lang w:val="fr-FR"/>
+              </w:rPr>
+              <w:t xml:space="preserve">anto.maturana@duocuc.cl</w:t>
+            </w:r>
+          </w:p>
+        </w:tc>
+      </w:tr>
+      <w:tr>
+        <w:trPr>
+          <w:trHeight w:val="255"/>
+        </w:trPr>
+        <w:tc>
+          <w:tcPr>
+            <w:cnfStyle w:val="000010000000" w:firstRow="0" w:lastRow="0" w:firstColumn="0" w:lastColumn="0" w:oddVBand="1" w:evenVBand="0" w:oddHBand="0" w:evenHBand="0" w:firstRowFirstColumn="0" w:firstRowLastColumn="0" w:lastRowFirstColumn="0" w:lastRowLastColumn="0"/>
+            <w:tcW w:w="3970" w:type="dxa"/>
+          </w:tcPr>
+          <w:p>
+            <w:pPr>
+              <w:numPr>
+                <w:ilvl w:val="0"/>
+                <w:numId w:val="0"/>
+              </w:numPr>
+              <w:spacing w:after="0"/>
+              <w:jc w:val="center"/>
+              <w:rPr>
+                <w:rFonts w:ascii="Arial" w:eastAsia="Arial Unicode MS" w:hAnsi="Arial" w:cs="Arial"/>
+                <w:lang w:val="fr-FR"/>
+              </w:rPr>
+            </w:pPr>
+            <w:r>
+              <w:rPr>
+                <w:rFonts w:ascii="Arial" w:eastAsia="Arial Unicode MS" w:hAnsi="Arial" w:cs="Arial"/>
+                <w:i w:val="0"/>
+                <w:iCs w:val="0"/>
+                <w:lang w:val="fr-FR"/>
+              </w:rPr>
+              <w:t xml:space="preserve">Steven San Martín</w:t>
+            </w:r>
+          </w:p>
+          <w:p>
+            <w:pPr>
+              <w:numPr>
+                <w:ilvl w:val="0"/>
+                <w:numId w:val="0"/>
+              </w:numPr>
+              <w:spacing w:after="0"/>
+              <w:jc w:val="center"/>
+              <w:rPr>
+                <w:rFonts w:ascii="Arial" w:eastAsia="Arial Unicode MS" w:hAnsi="Arial" w:cs="Arial"/>
+                <w:lang w:val="fr-FR"/>
+              </w:rPr>
+            </w:pPr>
+            <w:r>
+              <w:rPr>
+                <w:rFonts w:ascii="Arial" w:eastAsia="Arial Unicode MS" w:hAnsi="Arial" w:cs="Arial"/>
+                <w:i w:val="0"/>
+                <w:iCs w:val="0"/>
+                <w:lang w:val="fr-FR"/>
+              </w:rPr>
+              <w:t xml:space="preserve">NovaFit / Analista QA &amp; Testing</w:t>
+            </w:r>
+          </w:p>
+        </w:tc>
+        <w:tc>
+          <w:tcPr>
+            <w:tcW w:w="1559" w:type="dxa"/>
+          </w:tcPr>
+          <w:p>
+            <w:pPr>
+              <w:numPr>
+                <w:ilvl w:val="0"/>
+                <w:numId w:val="0"/>
+              </w:numPr>
+              <w:spacing w:after="0"/>
+              <w:jc w:val="center"/>
+              <w:cnfStyle w:val="000000000000" w:firstRow="0" w:lastRow="0" w:firstColumn="0" w:lastColumn="0" w:oddVBand="0" w:evenVBand="0" w:oddHBand="0" w:evenHBand="0" w:firstRowFirstColumn="0" w:firstRowLastColumn="0" w:lastRowFirstColumn="0" w:lastRowLastColumn="0"/>
+              <w:rPr>
+                <w:rFonts w:ascii="Tahoma" w:hAnsi="Tahoma" w:cs="Tahoma"/>
+                <w:lang w:val="fr-FR"/>
+              </w:rPr>
+            </w:pPr>
+            <w:r>
+              <w:rPr>
+                <w:rFonts w:ascii="Tahoma" w:hAnsi="Tahoma" w:cs="Tahoma"/>
+                <w:i w:val="0"/>
+                <w:iCs w:val="0"/>
+                <w:lang w:val="fr-FR"/>
+              </w:rPr>
+              <w:t xml:space="preserve">NovaFit</w:t>
+            </w:r>
+          </w:p>
+        </w:tc>
+        <w:tc>
+          <w:tcPr>
+            <w:cnfStyle w:val="000010000000" w:firstRow="0" w:lastRow="0" w:firstColumn="0" w:lastColumn="0" w:oddVBand="1" w:evenVBand="0" w:oddHBand="0" w:evenHBand="0" w:firstRowFirstColumn="0" w:firstRowLastColumn="0" w:lastRowFirstColumn="0" w:lastRowLastColumn="0"/>
+            <w:tcW w:w="1559" w:type="dxa"/>
+            <w:noWrap/>
+            <w:tcMar>
+              <w:left w:w="30" w:type="dxa"/>
+              <w:right w:w="30" w:type="dxa"/>
+            </w:tcMar>
+          </w:tcPr>
+          <w:p>
+            <w:pPr>
+              <w:numPr>
+                <w:ilvl w:val="0"/>
+                <w:numId w:val="0"/>
+              </w:numPr>
+              <w:spacing w:after="0"/>
+              <w:jc w:val="center"/>
+              <w:rPr>
+                <w:rFonts w:ascii="Tahoma" w:hAnsi="Tahoma" w:cs="Tahoma"/>
+                <w:lang w:val="fr-FR"/>
+              </w:rPr>
+            </w:pPr>
+            <w:r>
+              <w:rPr>
+                <w:rFonts w:ascii="Tahoma" w:hAnsi="Tahoma" w:cs="Tahoma"/>
+                <w:i w:val="0"/>
+                <w:iCs w:val="0"/>
+                <w:lang w:val="fr-FR"/>
+                <w:sz w:val="16"/>
+                <w:szCs w:val="16"/>
+              </w:rPr>
+              <w:t xml:space="preserve">+56 9 5531 8533</w:t>
+            </w:r>
+          </w:p>
+        </w:tc>
+        <w:tc>
+          <w:tcPr>
+            <w:tcW w:w="3260" w:type="dxa"/>
+          </w:tcPr>
+          <w:p>
+            <w:pPr>
+              <w:numPr>
+                <w:ilvl w:val="0"/>
+                <w:numId w:val="0"/>
+              </w:numPr>
+              <w:spacing w:after="0"/>
+              <w:cnfStyle w:val="000000000000" w:firstRow="0" w:lastRow="0" w:firstColumn="0" w:lastColumn="0" w:oddVBand="0" w:evenVBand="0" w:oddHBand="0" w:evenHBand="0" w:firstRowFirstColumn="0" w:firstRowLastColumn="0" w:lastRowFirstColumn="0" w:lastRowLastColumn="0"/>
+              <w:rPr>
+                <w:rFonts w:ascii="Tahoma" w:hAnsi="Tahoma" w:cs="Tahoma"/>
+                <w:color w:val="0000FF"/>
+                <w:u w:val="single"/>
+                <w:lang w:val="fr-FR"/>
+              </w:rPr>
+            </w:pPr>
+            <w:r>
+              <w:rPr>
+                <w:rFonts w:ascii="Tahoma" w:hAnsi="Tahoma" w:cs="Tahoma"/>
+                <w:i w:val="0"/>
+                <w:iCs w:val="0"/>
+                <w:color w:val="0000FF"/>
+                <w:u w:val="single"/>
+                <w:lang w:val="fr-FR"/>
+              </w:rPr>
+              <w:t xml:space="preserve">st.sanmartin@duocuc.cl</w:t>
+            </w:r>
           </w:p>
         </w:tc>
       </w:tr>
@@ -911,12 +1427,36 @@
     </w:p>
     <w:p>
       <w:pPr>
-        <w:tabs>
-          <w:tab w:val="left" w:pos="1368"/>
-        </w:tabs>
+        <w:numPr>
+          <w:ilvl w:val="0"/>
+          <w:numId w:val="0"/>
+        </w:numPr>
+        <w:spacing w:after="120"/>
+        <w:jc w:val="both"/>
       </w:pPr>
       <w:r>
-        <w:t>Breve descripción del proyecto al cual hace referencia el sprint</w:t>
+        <w:rPr>
+          <w:i w:val="0"/>
+          <w:iCs w:val="0"/>
+        </w:rPr>
+        <w:t xml:space="preserve">NovaFit Analytics Suite es una solución tecnológica integral de arquitectura SaaS, diseñada para centros de acondicionamiento físico, gimnasios y academias de entrenamiento. La suite combina un panel de administración web multisucursal (React + Vite, desplegado en Vercel), una aplicación móvil para atletas (React Native + Expo, en Android) y un backend de alto rendimiento construido con FastAPI, con base de datos relacional PostgreSQL 16 alojada en Supabase.</w:t>
+      </w:r>
+    </w:p>
+    <w:p>
+      <w:pPr>
+        <w:numPr>
+          <w:ilvl w:val="0"/>
+          <w:numId w:val="0"/>
+        </w:numPr>
+        <w:spacing w:after="120"/>
+        <w:jc w:val="both"/>
+      </w:pPr>
+      <w:r>
+        <w:rPr>
+          <w:i w:val="0"/>
+          <w:iCs w:val="0"/>
+        </w:rPr>
+        <w:t xml:space="preserve">El presente informe formaliza el cierre y balance técnico-operativo del sprint de la Fase 2 (Desarrollo y Construcción), ejecutado bajo el marco ágil Scrum y en concordancia con la Carta Gantt y la Matriz RACI del proyecto.</w:t>
       </w:r>
     </w:p>
     <w:p>
@@ -928,8 +1468,37 @@
       </w:r>
     </w:p>
     <w:p>
+      <w:pPr>
+        <w:numPr>
+          <w:ilvl w:val="0"/>
+          <w:numId w:val="0"/>
+        </w:numPr>
+        <w:spacing w:after="120"/>
+        <w:jc w:val="both"/>
+      </w:pPr>
       <w:r>
-        <w:t>Descripción de lo realizado en este sprint señalando fechas de ejecución y en caso de no realizar alguna tarea describir razón y cuando lo abordará</w:t>
+        <w:rPr>
+          <w:i w:val="0"/>
+          <w:iCs w:val="0"/>
+        </w:rPr>
+        <w:t xml:space="preserve">El ciclo de desarrollo de la Fase 2 se extendió entre el 07 de septiembre de 2026 y el 11 de octubre de 2026 (5 semanas de trabajo). El objetivo central fue la materialización de los componentes fundamentales del software: la API REST con sus módulos transaccionales, el esquema de base de datos relacional con migraciones automáticas Alembic, la integración de la pasarela de pagos Mercado Pago con webhooks en tiempo real, el motor analítico de fatiga ACWR (Acute:Chronic Workload Ratio), la integración de la API REST oficial de Zoho Mail bajo OAuth2 para notificaciones transaccionales seguras y la consolidación de la experiencia visual en el panel web y la aplicación móvil.</w:t>
+      </w:r>
+    </w:p>
+    <w:p>
+      <w:pPr>
+        <w:numPr>
+          <w:ilvl w:val="0"/>
+          <w:numId w:val="0"/>
+        </w:numPr>
+        <w:spacing w:after="120"/>
+        <w:jc w:val="both"/>
+      </w:pPr>
+      <w:r>
+        <w:rPr>
+          <w:i w:val="0"/>
+          <w:iCs w:val="0"/>
+        </w:rPr>
+        <w:t xml:space="preserve">Al cierre del ciclo, el equipo logró una tasa de completitud del 100% en los 16 casos de prueba del Plan de Pruebas NovaFit, validando la recaudación monetaria automática, el cálculo del riesgo de lesión y el despacho multicanal de avisos por correo electrónico y notificaciones móviles. No se registraron tareas críticas postergadas que comprometan la línea base de la Fase 2.</w:t>
       </w:r>
     </w:p>
     <w:p>
@@ -941,8 +1510,506 @@
       </w:r>
     </w:p>
     <w:p>
+      <w:pPr>
+        <w:numPr>
+          <w:ilvl w:val="0"/>
+          <w:numId w:val="0"/>
+        </w:numPr>
+        <w:spacing w:after="60"/>
+        <w:jc w:val="left"/>
+      </w:pPr>
       <w:r>
-        <w:t xml:space="preserve">Descripción detalla de las tareas realizadas y aquellas postergadas justificando </w:t>
+        <w:rPr>
+          <w:b/>
+          <w:i w:val="0"/>
+          <w:iCs w:val="0"/>
+        </w:rPr>
+        <w:t xml:space="preserve">Arquitectura backend y base de datos relacional</w:t>
+      </w:r>
+    </w:p>
+    <w:p>
+      <w:pPr>
+        <w:numPr>
+          <w:ilvl w:val="0"/>
+          <w:numId w:val="0"/>
+        </w:numPr>
+        <w:spacing w:after="60"/>
+        <w:ind w:left="567" w:hanging="283"/>
+        <w:jc w:val="both"/>
+      </w:pPr>
+      <w:r>
+        <w:rPr>
+          <w:i w:val="0"/>
+          <w:iCs w:val="0"/>
+        </w:rPr>
+        <w:t xml:space="preserve">–  Diseño e implementación del modelo relacional en PostgreSQL 16 con restricciones de integridad, llaves foráneas y auditoría contable (ON DELETE RESTRICT en transacciones financieras). El detalle se encuentra en el Diccionario de Datos.</w:t>
+      </w:r>
+    </w:p>
+    <w:p>
+      <w:pPr>
+        <w:numPr>
+          <w:ilvl w:val="0"/>
+          <w:numId w:val="0"/>
+        </w:numPr>
+        <w:spacing w:after="60"/>
+        <w:ind w:left="567" w:hanging="283"/>
+        <w:jc w:val="both"/>
+      </w:pPr>
+      <w:r>
+        <w:rPr>
+          <w:i w:val="0"/>
+          <w:iCs w:val="0"/>
+        </w:rPr>
+        <w:t xml:space="preserve">–  Migraciones automáticas con Alembic y SQLAlchemy 2.0 asíncrono, con sincronización continua entre el entorno local y Supabase/Render.</w:t>
+      </w:r>
+    </w:p>
+    <w:p>
+      <w:pPr>
+        <w:numPr>
+          <w:ilvl w:val="0"/>
+          <w:numId w:val="0"/>
+        </w:numPr>
+        <w:spacing w:after="60"/>
+        <w:ind w:left="567" w:hanging="283"/>
+        <w:jc w:val="both"/>
+      </w:pPr>
+      <w:r>
+        <w:rPr>
+          <w:i w:val="0"/>
+          <w:iCs w:val="0"/>
+        </w:rPr>
+        <w:t xml:space="preserve">–  Arquitectura multi-inquilino (multi-tenant) con aislamiento de sucursales mediante filtrado forzoso por branch_id en las consultas relacionales.</w:t>
+      </w:r>
+    </w:p>
+    <w:p>
+      <w:pPr>
+        <w:numPr>
+          <w:ilvl w:val="0"/>
+          <w:numId w:val="0"/>
+        </w:numPr>
+        <w:spacing w:after="60"/>
+        <w:ind w:left="567" w:hanging="283"/>
+        <w:jc w:val="both"/>
+      </w:pPr>
+      <w:r>
+        <w:rPr>
+          <w:i w:val="0"/>
+          <w:iCs w:val="0"/>
+        </w:rPr>
+        <w:t xml:space="preserve">–  Seguridad perimetral con JWT, hashing Bcrypt, CORS restringido y RBAC con 4 jerarquías: SuperAdmin, BranchAdmin, Trainer y Athlete.</w:t>
+      </w:r>
+    </w:p>
+    <w:p>
+      <w:pPr>
+        <w:numPr>
+          <w:ilvl w:val="0"/>
+          <w:numId w:val="0"/>
+        </w:numPr>
+        <w:spacing w:after="60"/>
+        <w:jc w:val="left"/>
+      </w:pPr>
+      <w:r>
+        <w:rPr>
+          <w:b/>
+          <w:i w:val="0"/>
+          <w:iCs w:val="0"/>
+        </w:rPr>
+        <w:t xml:space="preserve">Módulo de facturación y pasarela Mercado Pago</w:t>
+      </w:r>
+    </w:p>
+    <w:p>
+      <w:pPr>
+        <w:numPr>
+          <w:ilvl w:val="0"/>
+          <w:numId w:val="0"/>
+        </w:numPr>
+        <w:spacing w:after="60"/>
+        <w:ind w:left="567" w:hanging="283"/>
+        <w:jc w:val="both"/>
+      </w:pPr>
+      <w:r>
+        <w:rPr>
+          <w:i w:val="0"/>
+          <w:iCs w:val="0"/>
+        </w:rPr>
+        <w:t xml:space="preserve">–  Integración de Mercado Pago Checkout Pro: generación dinámica de Preference ID y enlaces de cobro para planes mensuales, trimestrales y anuales.</w:t>
+      </w:r>
+    </w:p>
+    <w:p>
+      <w:pPr>
+        <w:numPr>
+          <w:ilvl w:val="0"/>
+          <w:numId w:val="0"/>
+        </w:numPr>
+        <w:spacing w:after="60"/>
+        <w:ind w:left="567" w:hanging="283"/>
+        <w:jc w:val="both"/>
+      </w:pPr>
+      <w:r>
+        <w:rPr>
+          <w:i w:val="0"/>
+          <w:iCs w:val="0"/>
+        </w:rPr>
+        <w:t xml:space="preserve">–  Endpoint de Webhooks IPN con validación criptográfica para la confirmación desatendida de pagos y la actualización automática del estado de las membresías.</w:t>
+      </w:r>
+    </w:p>
+    <w:p>
+      <w:pPr>
+        <w:numPr>
+          <w:ilvl w:val="0"/>
+          <w:numId w:val="0"/>
+        </w:numPr>
+        <w:spacing w:after="60"/>
+        <w:ind w:left="567" w:hanging="283"/>
+        <w:jc w:val="both"/>
+      </w:pPr>
+      <w:r>
+        <w:rPr>
+          <w:i w:val="0"/>
+          <w:iCs w:val="0"/>
+        </w:rPr>
+        <w:t xml:space="preserve">–  Rediseño del flujo «Enviar cobro al correo» en el panel web: el administrador envía cobros formales con un solo clic y una plantilla personalizada.</w:t>
+      </w:r>
+    </w:p>
+    <w:p>
+      <w:pPr>
+        <w:numPr>
+          <w:ilvl w:val="0"/>
+          <w:numId w:val="0"/>
+        </w:numPr>
+        <w:spacing w:after="60"/>
+        <w:jc w:val="left"/>
+      </w:pPr>
+      <w:r>
+        <w:rPr>
+          <w:b/>
+          <w:i w:val="0"/>
+          <w:iCs w:val="0"/>
+        </w:rPr>
+        <w:t xml:space="preserve">Motor analítico de fatiga ACWR y prevención de lesiones</w:t>
+      </w:r>
+    </w:p>
+    <w:p>
+      <w:pPr>
+        <w:numPr>
+          <w:ilvl w:val="0"/>
+          <w:numId w:val="0"/>
+        </w:numPr>
+        <w:spacing w:after="60"/>
+        <w:ind w:left="567" w:hanging="283"/>
+        <w:jc w:val="both"/>
+      </w:pPr>
+      <w:r>
+        <w:rPr>
+          <w:i w:val="0"/>
+          <w:iCs w:val="0"/>
+        </w:rPr>
+        <w:t xml:space="preserve">–  Algoritmo ACWR con carga aguda móvil (7 días) y carga crónica móvil (28 días) a partir de las sesiones de entrenamiento (RPE × volumen).</w:t>
+      </w:r>
+    </w:p>
+    <w:p>
+      <w:pPr>
+        <w:numPr>
+          <w:ilvl w:val="0"/>
+          <w:numId w:val="0"/>
+        </w:numPr>
+        <w:spacing w:after="60"/>
+        <w:ind w:left="567" w:hanging="283"/>
+        <w:jc w:val="both"/>
+      </w:pPr>
+      <w:r>
+        <w:rPr>
+          <w:i w:val="0"/>
+          <w:iCs w:val="0"/>
+        </w:rPr>
+        <w:t xml:space="preserve">–  Lógica predictiva de sobreentrenamiento: cuando el ACWR supera 1,5, el sistema clasifica al socio como «Atleta en Riesgo».</w:t>
+      </w:r>
+    </w:p>
+    <w:p>
+      <w:pPr>
+        <w:numPr>
+          <w:ilvl w:val="0"/>
+          <w:numId w:val="0"/>
+        </w:numPr>
+        <w:spacing w:after="60"/>
+        <w:ind w:left="567" w:hanging="283"/>
+        <w:jc w:val="both"/>
+      </w:pPr>
+      <w:r>
+        <w:rPr>
+          <w:i w:val="0"/>
+          <w:iCs w:val="0"/>
+        </w:rPr>
+        <w:t xml:space="preserve">–  Despacho preventivo de alertas por correo (Zoho Mail REST API) y notificaciones push al atleta y a su preparador físico asignado.</w:t>
+      </w:r>
+    </w:p>
+    <w:p>
+      <w:pPr>
+        <w:numPr>
+          <w:ilvl w:val="0"/>
+          <w:numId w:val="0"/>
+        </w:numPr>
+        <w:spacing w:after="60"/>
+        <w:ind w:left="567" w:hanging="283"/>
+        <w:jc w:val="both"/>
+      </w:pPr>
+      <w:r>
+        <w:rPr>
+          <w:i w:val="0"/>
+          <w:iCs w:val="0"/>
+        </w:rPr>
+        <w:t xml:space="preserve">–  Control de tasa de alertas: máximo una notificación de riesgo por día por atleta, para evitar la fatiga informativa.</w:t>
+      </w:r>
+    </w:p>
+    <w:p>
+      <w:pPr>
+        <w:numPr>
+          <w:ilvl w:val="0"/>
+          <w:numId w:val="0"/>
+        </w:numPr>
+        <w:spacing w:after="60"/>
+        <w:jc w:val="left"/>
+      </w:pPr>
+      <w:r>
+        <w:rPr>
+          <w:b/>
+          <w:i w:val="0"/>
+          <w:iCs w:val="0"/>
+        </w:rPr>
+        <w:t xml:space="preserve">Notificaciones transaccionales (Zoho Mail API con OAuth2)</w:t>
+      </w:r>
+    </w:p>
+    <w:p>
+      <w:pPr>
+        <w:numPr>
+          <w:ilvl w:val="0"/>
+          <w:numId w:val="0"/>
+        </w:numPr>
+        <w:spacing w:after="60"/>
+        <w:ind w:left="567" w:hanging="283"/>
+        <w:jc w:val="both"/>
+      </w:pPr>
+      <w:r>
+        <w:rPr>
+          <w:i w:val="0"/>
+          <w:iCs w:val="0"/>
+        </w:rPr>
+        <w:t xml:space="preserve">–  Migración del protocolo SMTP tradicional a la API REST v1 de Zoho Mail con autenticación OAuth2 de servidor a servidor.</w:t>
+      </w:r>
+    </w:p>
+    <w:p>
+      <w:pPr>
+        <w:numPr>
+          <w:ilvl w:val="0"/>
+          <w:numId w:val="0"/>
+        </w:numPr>
+        <w:spacing w:after="60"/>
+        <w:ind w:left="567" w:hanging="283"/>
+        <w:jc w:val="both"/>
+      </w:pPr>
+      <w:r>
+        <w:rPr>
+          <w:i w:val="0"/>
+          <w:iCs w:val="0"/>
+        </w:rPr>
+        <w:t xml:space="preserve">–  Eliminación de los errores de TimeoutError derivados de las restricciones de puertos en el entorno de despliegue Render.</w:t>
+      </w:r>
+    </w:p>
+    <w:p>
+      <w:pPr>
+        <w:numPr>
+          <w:ilvl w:val="0"/>
+          <w:numId w:val="0"/>
+        </w:numPr>
+        <w:spacing w:after="60"/>
+        <w:ind w:left="567" w:hanging="283"/>
+        <w:jc w:val="both"/>
+      </w:pPr>
+      <w:r>
+        <w:rPr>
+          <w:i w:val="0"/>
+          <w:iCs w:val="0"/>
+        </w:rPr>
+        <w:t xml:space="preserve">–  Plantillas HTML responsivas con la identidad institucional NovaFit para bienvenida, facturación y avisos de salud deportiva.</w:t>
+      </w:r>
+    </w:p>
+    <w:p>
+      <w:pPr>
+        <w:numPr>
+          <w:ilvl w:val="0"/>
+          <w:numId w:val="0"/>
+        </w:numPr>
+        <w:spacing w:after="60"/>
+        <w:jc w:val="left"/>
+      </w:pPr>
+      <w:r>
+        <w:rPr>
+          <w:b/>
+          <w:i w:val="0"/>
+          <w:iCs w:val="0"/>
+        </w:rPr>
+        <w:t xml:space="preserve">Panel web administrativo y aplicación móvil</w:t>
+      </w:r>
+    </w:p>
+    <w:p>
+      <w:pPr>
+        <w:numPr>
+          <w:ilvl w:val="0"/>
+          <w:numId w:val="0"/>
+        </w:numPr>
+        <w:spacing w:after="60"/>
+        <w:ind w:left="567" w:hanging="283"/>
+        <w:jc w:val="both"/>
+      </w:pPr>
+      <w:r>
+        <w:rPr>
+          <w:i w:val="0"/>
+          <w:iCs w:val="0"/>
+        </w:rPr>
+        <w:t xml:space="preserve">–  Panel web desplegado en Vercel con las vistas operativas: Dashboard de KPIs, Mantenedor de Atletas, Facturación y Cobros, Catálogo de Ejercicios y Gestión de Rutinas.</w:t>
+      </w:r>
+    </w:p>
+    <w:p>
+      <w:pPr>
+        <w:numPr>
+          <w:ilvl w:val="0"/>
+          <w:numId w:val="0"/>
+        </w:numPr>
+        <w:spacing w:after="60"/>
+        <w:ind w:left="567" w:hanging="283"/>
+        <w:jc w:val="both"/>
+      </w:pPr>
+      <w:r>
+        <w:rPr>
+          <w:i w:val="0"/>
+          <w:iCs w:val="0"/>
+        </w:rPr>
+        <w:t xml:space="preserve">–  Compilación y empaquetado de la aplicación móvil Android en React Native / Expo, con registro automático del PushToken en Supabase.</w:t>
+      </w:r>
+    </w:p>
+    <w:p>
+      <w:pPr>
+        <w:numPr>
+          <w:ilvl w:val="0"/>
+          <w:numId w:val="0"/>
+        </w:numPr>
+        <w:spacing w:after="60"/>
+        <w:ind w:left="567" w:hanging="283"/>
+        <w:jc w:val="both"/>
+      </w:pPr>
+      <w:r>
+        <w:rPr>
+          <w:i w:val="0"/>
+          <w:iCs w:val="0"/>
+        </w:rPr>
+        <w:t xml:space="preserve">–  Caché de animaciones GIF para más de 50 ejercicios, que reduce el tiempo de renderizado móvil de 4,0 s a menos de 500 ms.</w:t>
+      </w:r>
+    </w:p>
+    <w:p>
+      <w:pPr>
+        <w:numPr>
+          <w:ilvl w:val="0"/>
+          <w:numId w:val="0"/>
+        </w:numPr>
+        <w:spacing w:after="60"/>
+        <w:ind w:left="567" w:hanging="283"/>
+        <w:jc w:val="both"/>
+      </w:pPr>
+      <w:r>
+        <w:rPr>
+          <w:i w:val="0"/>
+          <w:iCs w:val="0"/>
+        </w:rPr>
+        <w:t xml:space="preserve">–  Componente ServerWakeUp, con indicador e información contextual, para gestionar el cold start de Render.</w:t>
+      </w:r>
+    </w:p>
+    <w:p>
+      <w:pPr>
+        <w:numPr>
+          <w:ilvl w:val="0"/>
+          <w:numId w:val="0"/>
+        </w:numPr>
+        <w:spacing w:after="60"/>
+        <w:jc w:val="left"/>
+      </w:pPr>
+      <w:r>
+        <w:rPr>
+          <w:b/>
+          <w:i w:val="0"/>
+          <w:iCs w:val="0"/>
+        </w:rPr>
+        <w:t xml:space="preserve">Aseguramiento de calidad y control de cambios</w:t>
+      </w:r>
+    </w:p>
+    <w:p>
+      <w:pPr>
+        <w:numPr>
+          <w:ilvl w:val="0"/>
+          <w:numId w:val="0"/>
+        </w:numPr>
+        <w:spacing w:after="60"/>
+        <w:ind w:left="567" w:hanging="283"/>
+        <w:jc w:val="both"/>
+      </w:pPr>
+      <w:r>
+        <w:rPr>
+          <w:i w:val="0"/>
+          <w:iCs w:val="0"/>
+        </w:rPr>
+        <w:t xml:space="preserve">–  Ejecución de los 16 casos de prueba del Plan de Pruebas NovaFit, que cubren autenticación, integridad contable, webhooks, ACWR y notificaciones, con 100% de aprobación.</w:t>
+      </w:r>
+    </w:p>
+    <w:p>
+      <w:pPr>
+        <w:numPr>
+          <w:ilvl w:val="0"/>
+          <w:numId w:val="0"/>
+        </w:numPr>
+        <w:spacing w:after="60"/>
+        <w:ind w:left="567" w:hanging="283"/>
+        <w:jc w:val="both"/>
+      </w:pPr>
+      <w:r>
+        <w:rPr>
+          <w:i w:val="0"/>
+          <w:iCs w:val="0"/>
+        </w:rPr>
+        <w:t xml:space="preserve">–  Registro formal de 10 Solicitudes de Cambio (SC-01 a SC-10) en la Matriz de Control de Cambio.</w:t>
+      </w:r>
+    </w:p>
+    <w:p>
+      <w:pPr>
+        <w:numPr>
+          <w:ilvl w:val="0"/>
+          <w:numId w:val="0"/>
+        </w:numPr>
+        <w:spacing w:after="60"/>
+        <w:jc w:val="left"/>
+      </w:pPr>
+      <w:r>
+        <w:rPr>
+          <w:b/>
+          <w:i w:val="0"/>
+          <w:iCs w:val="0"/>
+        </w:rPr>
+        <w:t xml:space="preserve">Tareas postergadas y justificación</w:t>
+      </w:r>
+    </w:p>
+    <w:p>
+      <w:pPr>
+        <w:numPr>
+          <w:ilvl w:val="0"/>
+          <w:numId w:val="0"/>
+        </w:numPr>
+        <w:spacing w:after="120"/>
+        <w:jc w:val="both"/>
+      </w:pPr>
+      <w:r>
+        <w:rPr>
+          <w:i w:val="0"/>
+          <w:iCs w:val="0"/>
+        </w:rPr>
+        <w:t xml:space="preserve">No se registraron tareas críticas postergadas. Se programó para el inicio de la Fase 3 la calibración de umbrales biométricos adicionales (hidratación y sueño en la app móvil), por corresponder a valor agregado secundario y no esencial para la validación del núcleo del negocio.</w:t>
       </w:r>
     </w:p>
     <w:p>
@@ -954,8 +2021,92 @@
       </w:r>
     </w:p>
     <w:p>
+      <w:pPr>
+        <w:numPr>
+          <w:ilvl w:val="0"/>
+          <w:numId w:val="0"/>
+        </w:numPr>
+        <w:spacing w:after="120"/>
+        <w:jc w:val="both"/>
+      </w:pPr>
       <w:r>
-        <w:t>Descripción macro de lo que se comprometen a realizar en el próximo sprint</w:t>
+        <w:rPr>
+          <w:i w:val="0"/>
+          <w:iCs w:val="0"/>
+        </w:rPr>
+        <w:t xml:space="preserve">El siguiente ciclo corresponde a la Fase 3 del proyecto («Pruebas Finales, Implantación y Cierre»), cuyo foco será:</w:t>
+      </w:r>
+    </w:p>
+    <w:p>
+      <w:pPr>
+        <w:numPr>
+          <w:ilvl w:val="0"/>
+          <w:numId w:val="0"/>
+        </w:numPr>
+        <w:spacing w:after="60"/>
+        <w:ind w:left="567" w:hanging="283"/>
+        <w:jc w:val="both"/>
+      </w:pPr>
+      <w:r>
+        <w:rPr>
+          <w:i w:val="0"/>
+          <w:iCs w:val="0"/>
+        </w:rPr>
+        <w:t xml:space="preserve">–  Ejecución de pruebas de carga y estrés concurrentes sobre la API FastAPI en Render.</w:t>
+      </w:r>
+    </w:p>
+    <w:p>
+      <w:pPr>
+        <w:numPr>
+          <w:ilvl w:val="0"/>
+          <w:numId w:val="0"/>
+        </w:numPr>
+        <w:spacing w:after="60"/>
+        <w:ind w:left="567" w:hanging="283"/>
+        <w:jc w:val="both"/>
+      </w:pPr>
+      <w:r>
+        <w:rPr>
+          <w:i w:val="0"/>
+          <w:iCs w:val="0"/>
+        </w:rPr>
+        <w:t xml:space="preserve">–  Pruebas de aceptación de usuario (UAT) en un entorno real con entrenadores y socios de la red NovaFit.</w:t>
+      </w:r>
+    </w:p>
+    <w:p>
+      <w:pPr>
+        <w:numPr>
+          <w:ilvl w:val="0"/>
+          <w:numId w:val="0"/>
+        </w:numPr>
+        <w:spacing w:after="60"/>
+        <w:ind w:left="567" w:hanging="283"/>
+        <w:jc w:val="both"/>
+      </w:pPr>
+      <w:r>
+        <w:rPr>
+          <w:i w:val="0"/>
+          <w:iCs w:val="0"/>
+        </w:rPr>
+        <w:t xml:space="preserve">–  Generación de los manuales de usuario y de administración del sistema.</w:t>
+      </w:r>
+    </w:p>
+    <w:p>
+      <w:pPr>
+        <w:numPr>
+          <w:ilvl w:val="0"/>
+          <w:numId w:val="0"/>
+        </w:numPr>
+        <w:spacing w:after="60"/>
+        <w:ind w:left="567" w:hanging="283"/>
+        <w:jc w:val="both"/>
+      </w:pPr>
+      <w:r>
+        <w:rPr>
+          <w:i w:val="0"/>
+          <w:iCs w:val="0"/>
+        </w:rPr>
+        <w:t xml:space="preserve">–  Preparación de la defensa oral y de la presentación final de título ante la comisión evaluadora de Duoc UC.</w:t>
       </w:r>
     </w:p>
     <w:p>
@@ -967,8 +2118,164 @@
       </w:r>
     </w:p>
     <w:p>
+      <w:pPr>
+        <w:numPr>
+          <w:ilvl w:val="0"/>
+          <w:numId w:val="0"/>
+        </w:numPr>
+        <w:spacing w:after="120"/>
+        <w:jc w:val="both"/>
+      </w:pPr>
       <w:r>
-        <w:t>Todo lo que acompañe como evidencia de las tareas realizas en el Sprint</w:t>
+        <w:rPr>
+          <w:i w:val="0"/>
+          <w:iCs w:val="0"/>
+        </w:rPr>
+        <w:t xml:space="preserve">Se adjuntan como evidencias que respaldan el cumplimiento de este informe:</w:t>
+      </w:r>
+    </w:p>
+    <w:p>
+      <w:pPr>
+        <w:numPr>
+          <w:ilvl w:val="0"/>
+          <w:numId w:val="0"/>
+        </w:numPr>
+        <w:spacing w:after="60"/>
+        <w:ind w:left="567" w:hanging="283"/>
+        <w:jc w:val="both"/>
+      </w:pPr>
+      <w:r>
+        <w:rPr>
+          <w:i w:val="0"/>
+          <w:iCs w:val="0"/>
+        </w:rPr>
+        <w:t xml:space="preserve">–  Documento de Arquitectura del Sistema (DAS), versión 2.1.</w:t>
+      </w:r>
+    </w:p>
+    <w:p>
+      <w:pPr>
+        <w:numPr>
+          <w:ilvl w:val="0"/>
+          <w:numId w:val="0"/>
+        </w:numPr>
+        <w:spacing w:after="60"/>
+        <w:ind w:left="567" w:hanging="283"/>
+        <w:jc w:val="both"/>
+      </w:pPr>
+      <w:r>
+        <w:rPr>
+          <w:i w:val="0"/>
+          <w:iCs w:val="0"/>
+        </w:rPr>
+        <w:t xml:space="preserve">–  Diccionario de Datos con las tablas y relaciones del modelo relacional.</w:t>
+      </w:r>
+    </w:p>
+    <w:p>
+      <w:pPr>
+        <w:numPr>
+          <w:ilvl w:val="0"/>
+          <w:numId w:val="0"/>
+        </w:numPr>
+        <w:spacing w:after="60"/>
+        <w:ind w:left="567" w:hanging="283"/>
+        <w:jc w:val="both"/>
+      </w:pPr>
+      <w:r>
+        <w:rPr>
+          <w:i w:val="0"/>
+          <w:iCs w:val="0"/>
+        </w:rPr>
+        <w:t xml:space="preserve">–  Documento de Procesos de Negocio con los modelos TO-BE.</w:t>
+      </w:r>
+    </w:p>
+    <w:p>
+      <w:pPr>
+        <w:numPr>
+          <w:ilvl w:val="0"/>
+          <w:numId w:val="0"/>
+        </w:numPr>
+        <w:spacing w:after="60"/>
+        <w:ind w:left="567" w:hanging="283"/>
+        <w:jc w:val="both"/>
+      </w:pPr>
+      <w:r>
+        <w:rPr>
+          <w:i w:val="0"/>
+          <w:iCs w:val="0"/>
+        </w:rPr>
+        <w:t xml:space="preserve">–  Matriz de Control de Cambio con 10 solicitudes formales evaluadas y aprobadas.</w:t>
+      </w:r>
+    </w:p>
+    <w:p>
+      <w:pPr>
+        <w:numPr>
+          <w:ilvl w:val="0"/>
+          <w:numId w:val="0"/>
+        </w:numPr>
+        <w:spacing w:after="60"/>
+        <w:ind w:left="567" w:hanging="283"/>
+        <w:jc w:val="both"/>
+      </w:pPr>
+      <w:r>
+        <w:rPr>
+          <w:i w:val="0"/>
+          <w:iCs w:val="0"/>
+        </w:rPr>
+        <w:t xml:space="preserve">–  Matriz de Riesgo y Matriz de Asignación de Responsabilidades (RACI).</w:t>
+      </w:r>
+    </w:p>
+    <w:p>
+      <w:pPr>
+        <w:numPr>
+          <w:ilvl w:val="0"/>
+          <w:numId w:val="0"/>
+        </w:numPr>
+        <w:spacing w:after="60"/>
+        <w:ind w:left="567" w:hanging="283"/>
+        <w:jc w:val="both"/>
+      </w:pPr>
+      <w:r>
+        <w:rPr>
+          <w:i w:val="0"/>
+          <w:iCs w:val="0"/>
+        </w:rPr>
+        <w:t xml:space="preserve">–  Plan de Pruebas de Software con 16 casos de prueba aprobados (100% de éxito).</w:t>
+      </w:r>
+    </w:p>
+    <w:p>
+      <w:pPr>
+        <w:numPr>
+          <w:ilvl w:val="0"/>
+          <w:numId w:val="0"/>
+        </w:numPr>
+        <w:spacing w:after="60"/>
+        <w:ind w:left="567" w:hanging="283"/>
+        <w:jc w:val="both"/>
+      </w:pPr>
+      <w:r>
+        <w:rPr>
+          <w:i w:val="0"/>
+          <w:iCs w:val="0"/>
+        </w:rPr>
+        <w:t xml:space="preserve">–  Minutas de reunión APT-04, APT-05 y APT-06 e Informe de Avance de Proyecto Fase 2.</w:t>
+      </w:r>
+    </w:p>
+    <w:p>
+      <w:pPr>
+        <w:numPr>
+          <w:ilvl w:val="0"/>
+          <w:numId w:val="0"/>
+        </w:numPr>
+        <w:spacing w:after="60"/>
+        <w:ind w:left="567" w:hanging="283"/>
+        <w:jc w:val="both"/>
+      </w:pPr>
+      <w:r>
+        <w:rPr>
+          <w:i w:val="0"/>
+          <w:iCs w:val="0"/>
+        </w:rPr>
+        <w:t xml:space="preserve">–  Repositorio de código fuente con el historial de commits y de despliegue en Vercel y Render.</w:t>
       </w:r>
     </w:p>
     <w:sectPr>

</xml_diff>